<commit_message>
fix: clarify V5 magnet polarity and validation boundaries
</commit_message>
<xml_diff>
--- a/release/v5/docs/Ugrinsky-Wind-Wall-V5-Bauanleitung.docx
+++ b/release/v5/docs/Ugrinsky-Wind-Wall-V5-Bauanleitung.docx
@@ -4009,7 +4009,7 @@
         <w:drawing>
           <wp:inline xmlns:a="http://schemas.openxmlformats.org/drawingml/2006/main" xmlns:pic="http://schemas.openxmlformats.org/drawingml/2006/picture">
             <wp:extent cx="6264000" cy="4384800"/>
-            <wp:docPr id="5" name="Picture 5" descr="E06. Kassette, Deckel und Base sind angehoben; der untere Magnetrotor bleibt im aufgeschnittenen Gehäuse. Unterer Rotor unter der stationären Wicklung. Base-Blätter zur Lesbarkeit gekürzt. Base mit oberem Magnetträger · rotierend Deckel und 51105-Aufnahme · stationär Spulenkassette · stationär Aktiver Wicklungsraum · stationär Unterer Magnetrotor im Gehäuse · rotierend Gehäuse / Bodenlaschen · stationär 6 × M4-Deckelschraube (1 gezeigt) 6 × gefangene M4-Mutter (1 gezeigt)" title="E06"/>
+            <wp:docPr id="5" name="Picture 5" descr="E06. Kassette, Deckel und Base sind angehoben; der untere Magnetrotor bleibt im aufgeschnittenen Gehäuse. Unterer Rotor unter der stationären Wicklung. Base-Blätter zur Lesbarkeit gekürzt. Base mit oberem Magnetträger · rotierend Deckel und 51105-Aufnahme · stationär Spulenkassette · stationär Aktiver Wicklungsraum · stationär Unterer Magnetrotor im Gehäuse · rotierend Gehäuse / Bodenlaschen · stationär 6 × M4-Deckelschraube (1 gezeigt) 6 × gefangene M4-Mutter (1 gezeigt) Beide Ringe haben 18 zur Wicklung weisende Pole, oben N S im Wechsel, unten S N. Gleiche Winkel in derselben +Z-Projektion tragen gegenüberliegende Pole; bei 0 Grad oben N und unten S, bei 20 Grad oben S und unten N." title="E06"/>
             <wp:cNvGraphicFramePr>
               <a:graphicFrameLocks noChangeAspect="1"/>
             </wp:cNvGraphicFramePr>
@@ -4135,7 +4135,7 @@
         <w:drawing>
           <wp:inline xmlns:a="http://schemas.openxmlformats.org/drawingml/2006/main" xmlns:pic="http://schemas.openxmlformats.org/drawingml/2006/picture">
             <wp:extent cx="6264000" cy="4384800"/>
-            <wp:docPr id="7" name="Picture 7" descr="E07. Zwei rotierende Magnetträger umschließen die stationäre Wicklung; der untere Rotor sitzt im Gehäuse. Nennabstand Magnet–Wicklung: oben 1.5 mm / unten 1.5 mm. Keine Betriebsfreigabe. Base / oberer Magnetträger · rotierend Deckel über der Wicklung · stationär Wicklungsraum · stationär Spulenkassette / Boden · stationär Unterer Magnetrotor · rotierend Gehäuse mit geschlossenem Boden · stationär M8-Mutter im unteren Rotor" title="E07"/>
+            <wp:docPr id="7" name="Picture 7" descr="E07. Zwei rotierende Magnetträger umschließen die stationäre Wicklung; der untere Rotor sitzt im Gehäuse. Magnetfläche–aktive Wicklung: oben 1.5 mm / unten 1.5 mm, einschließlich Kunststoff. Mechanisch: Magnet–Deckel 0,35 mm; Magnet–Kassettenboden 0,50 mm. Base / oberer Magnetträger · rotierend Deckel über der Wicklung · stationär Wicklungsraum · stationär Spulenkassette / Boden · stationär Unterer Magnetrotor · rotierend Gehäuse mit geschlossenem Boden · stationär M8-Mutter im unteren Rotor Beide Ringe haben 18 zur Wicklung weisende Pole, oben N S im Wechsel, unten S N. Gleiche Winkel in derselben +Z-Projektion tragen gegenüberliegende Pole; bei 0 Grad oben N und unten S, bei 20 Grad oben S und unten N." title="E07"/>
             <wp:cNvGraphicFramePr>
               <a:graphicFrameLocks noChangeAspect="1"/>
             </wp:cNvGraphicFramePr>
@@ -4177,7 +4177,12 @@
     </w:p>
     <w:p>
       <w:r>
-        <w:t>Oben sind 1,5 mm und unten 1,5 mm nominal vorgesehen. Diese Luftspalte gelten nur, wenn Magnete bündig oder tiefer in ihren Taschen sitzen. Überstand, Klebstoff, Wicklungshöhe, axialer Versatz und Rundlauf können den tatsächlichen kleinsten Spalt verringern.</w:t>
+        <w:t>Oben sind 1,5 mm und unten 1,5 mm nominal von der Magnetfläche zur aktiven Wicklungsfläche vorgesehen. Beide magnetischen Abstände schließen den dazwischenliegenden Kunststoff ein: oben die Deckelmembran, unten den Kassettenboden. Sie gelten nur, wenn Magnete bündig oder tiefer in ihren Taschen sitzen. Überstand, Klebstoff, Wicklungshöhe, axialer Versatz und Rundlauf können den tatsächlichen kleinsten Abstand verringern.</w:t>
+      </w:r>
+    </w:p>
+    <w:p>
+      <w:r>
+        <w:t>Die mechanischen Freigänge sind kleiner: oben 0,35 mm zwischen Magnetfläche und Deckelmembran, unten 0,50 mm zwischen Magnetfläche und Kassettenboden. Die Membran und der Kassettenboden sind jeweils 1,00 mm dick. Zwischen Kassettenoberkante und Deckelunterseite bleiben 0,15 mm zur axialen Rückhaltung. Magnetische Abstände und mechanische Freigänge getrennt prüfen.</w:t>
       </w:r>
     </w:p>
     <w:p>

</xml_diff>

<commit_message>
feat: refine generator coil cassette and rotor spacer
</commit_message>
<xml_diff>
--- a/release/v5/docs/Ugrinsky-Wind-Wall-V5-Bauanleitung.docx
+++ b/release/v5/docs/Ugrinsky-Wind-Wall-V5-Bauanleitung.docx
@@ -2158,7 +2158,7 @@
               <w:rPr>
                 <w:sz w:val="20"/>
               </w:rPr>
-              <w:t>1</w:t>
+              <w:t>36</w:t>
             </w:r>
           </w:p>
         </w:tc>
@@ -2176,7 +2176,7 @@
               <w:rPr>
                 <w:sz w:val="20"/>
               </w:rPr>
-              <w:t>Distanzhülse</w:t>
+              <w:t>Magnete</w:t>
             </w:r>
           </w:p>
         </w:tc>
@@ -2194,7 +2194,7 @@
               <w:rPr>
                 <w:sz w:val="20"/>
               </w:rPr>
-              <w:t>12 × 17,85 mm; Außendurchmesser und Länge; M8-Durchgang prüfen</w:t>
+              <w:t>Zwei Ringe mit je 18 Magneten; Projektziel 10 × 2 mm, reale Maße und Halterung prüfen</w:t>
             </w:r>
           </w:p>
         </w:tc>
@@ -2218,7 +2218,7 @@
               <w:rPr>
                 <w:sz w:val="20"/>
               </w:rPr>
-              <w:t>36</w:t>
+              <w:t>1</w:t>
             </w:r>
           </w:p>
         </w:tc>
@@ -2236,7 +2236,7 @@
               <w:rPr>
                 <w:sz w:val="20"/>
               </w:rPr>
-              <w:t>Magnete</w:t>
+              <w:t>Axiallager 51105 komplett</w:t>
             </w:r>
           </w:p>
         </w:tc>
@@ -2254,7 +2254,7 @@
               <w:rPr>
                 <w:sz w:val="20"/>
               </w:rPr>
-              <w:t>Zwei Ringe mit je 18 Magneten; Projektziel 10 × 2 mm, reale Maße und Halterung prüfen</w:t>
+              <w:t>25 × 42 × 11 mm</w:t>
             </w:r>
           </w:p>
         </w:tc>
@@ -2296,7 +2296,7 @@
               <w:rPr>
                 <w:sz w:val="20"/>
               </w:rPr>
-              <w:t>Axiallager 51105 komplett</w:t>
+              <w:t>Radiallager 608</w:t>
             </w:r>
           </w:p>
         </w:tc>
@@ -2314,7 +2314,7 @@
               <w:rPr>
                 <w:sz w:val="20"/>
               </w:rPr>
-              <w:t>25 × 42 × 11 mm</w:t>
+              <w:t>8 × 22 × 7 mm</w:t>
             </w:r>
           </w:p>
         </w:tc>
@@ -2338,7 +2338,7 @@
               <w:rPr>
                 <w:sz w:val="20"/>
               </w:rPr>
-              <w:t>1</w:t>
+              <w:t>4</w:t>
             </w:r>
           </w:p>
         </w:tc>
@@ -2356,7 +2356,7 @@
               <w:rPr>
                 <w:sz w:val="20"/>
               </w:rPr>
-              <w:t>Radiallager 608</w:t>
+              <w:t>M4 Deckelschrauben</w:t>
             </w:r>
           </w:p>
         </w:tc>
@@ -2374,127 +2374,7 @@
               <w:rPr>
                 <w:sz w:val="20"/>
               </w:rPr>
-              <w:t>8 × 22 × 7 mm</w:t>
-            </w:r>
-          </w:p>
-        </w:tc>
-      </w:tr>
-      <w:tr>
-        <w:trPr>
-          <w:cantSplit/>
-        </w:trPr>
-        <w:tc>
-          <w:tcPr>
-            <w:tcW w:type="dxa" w:w="680"/>
-            <w:vAlign w:val="center"/>
-            <w:shd w:fill="FFFFFF"/>
-          </w:tcPr>
-          <w:p>
-            <w:pPr>
-              <w:spacing w:after="0" w:line="252" w:lineRule="auto"/>
-              <w:jc w:val="center"/>
-            </w:pPr>
-            <w:r>
-              <w:rPr>
-                <w:sz w:val="20"/>
-              </w:rPr>
-              <w:t>6</w:t>
-            </w:r>
-          </w:p>
-        </w:tc>
-        <w:tc>
-          <w:tcPr>
-            <w:tcW w:type="dxa" w:w="2778"/>
-            <w:vAlign w:val="center"/>
-            <w:shd w:fill="FFFFFF"/>
-          </w:tcPr>
-          <w:p>
-            <w:pPr>
-              <w:spacing w:after="0" w:line="252" w:lineRule="auto"/>
-            </w:pPr>
-            <w:r>
-              <w:rPr>
-                <w:sz w:val="20"/>
-              </w:rPr>
-              <w:t>M4 Deckelschrauben</w:t>
-            </w:r>
-          </w:p>
-        </w:tc>
-        <w:tc>
-          <w:tcPr>
-            <w:tcW w:type="dxa" w:w="6406"/>
-            <w:vAlign w:val="center"/>
-            <w:shd w:fill="FFFFFF"/>
-          </w:tcPr>
-          <w:p>
-            <w:pPr>
-              <w:spacing w:after="0" w:line="252" w:lineRule="auto"/>
-            </w:pPr>
-            <w:r>
-              <w:rPr>
-                <w:sz w:val="20"/>
-              </w:rPr>
               <w:t>Länge und Kopfform am realen Stapel prüfen; keine freigegebene Kataloglänge</w:t>
-            </w:r>
-          </w:p>
-        </w:tc>
-      </w:tr>
-      <w:tr>
-        <w:trPr>
-          <w:cantSplit/>
-        </w:trPr>
-        <w:tc>
-          <w:tcPr>
-            <w:tcW w:type="dxa" w:w="680"/>
-            <w:vAlign w:val="center"/>
-            <w:shd w:fill="F4F4F4"/>
-          </w:tcPr>
-          <w:p>
-            <w:pPr>
-              <w:spacing w:after="0" w:line="252" w:lineRule="auto"/>
-              <w:jc w:val="center"/>
-            </w:pPr>
-            <w:r>
-              <w:rPr>
-                <w:sz w:val="20"/>
-              </w:rPr>
-              <w:t>6</w:t>
-            </w:r>
-          </w:p>
-        </w:tc>
-        <w:tc>
-          <w:tcPr>
-            <w:tcW w:type="dxa" w:w="2778"/>
-            <w:vAlign w:val="center"/>
-            <w:shd w:fill="F4F4F4"/>
-          </w:tcPr>
-          <w:p>
-            <w:pPr>
-              <w:spacing w:after="0" w:line="252" w:lineRule="auto"/>
-            </w:pPr>
-            <w:r>
-              <w:rPr>
-                <w:sz w:val="20"/>
-              </w:rPr>
-              <w:t>Gefangene M4 Muttern</w:t>
-            </w:r>
-          </w:p>
-        </w:tc>
-        <w:tc>
-          <w:tcPr>
-            <w:tcW w:type="dxa" w:w="6406"/>
-            <w:vAlign w:val="center"/>
-            <w:shd w:fill="F4F4F4"/>
-          </w:tcPr>
-          <w:p>
-            <w:pPr>
-              <w:spacing w:after="0" w:line="252" w:lineRule="auto"/>
-            </w:pPr>
-            <w:r>
-              <w:rPr>
-                <w:sz w:val="20"/>
-              </w:rPr>
-              <w:t>Sechskant; vollständig in Gehäusetaschen einsetzen</w:t>
             </w:r>
           </w:p>
         </w:tc>
@@ -2536,7 +2416,7 @@
               <w:rPr>
                 <w:sz w:val="20"/>
               </w:rPr>
-              <w:t>Holzschrauben unten</w:t>
+              <w:t>Gefangene M4 Muttern</w:t>
             </w:r>
           </w:p>
         </w:tc>
@@ -2554,7 +2434,7 @@
               <w:rPr>
                 <w:sz w:val="20"/>
               </w:rPr>
-              <w:t>Holzschraube 4 × 30 mm, flacher Kopf Ø9; nicht drucken; ungeprüfte Nennhülle</w:t>
+              <w:t>Sechskant; vollständig in Gehäusetaschen einsetzen</w:t>
             </w:r>
           </w:p>
         </w:tc>
@@ -2596,6 +2476,66 @@
               <w:rPr>
                 <w:sz w:val="20"/>
               </w:rPr>
+              <w:t>Holzschrauben unten</w:t>
+            </w:r>
+          </w:p>
+        </w:tc>
+        <w:tc>
+          <w:tcPr>
+            <w:tcW w:type="dxa" w:w="6406"/>
+            <w:vAlign w:val="center"/>
+            <w:shd w:fill="F4F4F4"/>
+          </w:tcPr>
+          <w:p>
+            <w:pPr>
+              <w:spacing w:after="0" w:line="252" w:lineRule="auto"/>
+            </w:pPr>
+            <w:r>
+              <w:rPr>
+                <w:sz w:val="20"/>
+              </w:rPr>
+              <w:t>Holzschraube 4 × 30 mm, flacher Kopf Ø9; nicht drucken; ungeprüfte Nennhülle</w:t>
+            </w:r>
+          </w:p>
+        </w:tc>
+      </w:tr>
+      <w:tr>
+        <w:trPr>
+          <w:cantSplit/>
+        </w:trPr>
+        <w:tc>
+          <w:tcPr>
+            <w:tcW w:type="dxa" w:w="680"/>
+            <w:vAlign w:val="center"/>
+            <w:shd w:fill="FFFFFF"/>
+          </w:tcPr>
+          <w:p>
+            <w:pPr>
+              <w:spacing w:after="0" w:line="252" w:lineRule="auto"/>
+              <w:jc w:val="center"/>
+            </w:pPr>
+            <w:r>
+              <w:rPr>
+                <w:sz w:val="20"/>
+              </w:rPr>
+              <w:t>4</w:t>
+            </w:r>
+          </w:p>
+        </w:tc>
+        <w:tc>
+          <w:tcPr>
+            <w:tcW w:type="dxa" w:w="2778"/>
+            <w:vAlign w:val="center"/>
+            <w:shd w:fill="FFFFFF"/>
+          </w:tcPr>
+          <w:p>
+            <w:pPr>
+              <w:spacing w:after="0" w:line="252" w:lineRule="auto"/>
+            </w:pPr>
+            <w:r>
+              <w:rPr>
+                <w:sz w:val="20"/>
+              </w:rPr>
               <w:t>Holzschrauben oben</w:t>
             </w:r>
           </w:p>
@@ -2604,7 +2544,7 @@
           <w:tcPr>
             <w:tcW w:type="dxa" w:w="6406"/>
             <w:vAlign w:val="center"/>
-            <w:shd w:fill="F4F4F4"/>
+            <w:shd w:fill="FFFFFF"/>
           </w:tcPr>
           <w:p>
             <w:pPr>
@@ -3551,7 +3491,7 @@
     </w:p>
     <w:p>
       <w:r>
-        <w:t>Lege den isolierten Draht in wiederholten, zusammenhängenden Serpentinen durch die aktiven Polbereiche der stationären Kassette. Markiere Anfang A, Ende B und den Weg einer vollständigen Wiederholung. Für diese Versuchsreihe zählt eine vollständige Wiederholung derselben Serpentine als eine Windung. Alle drei Testspulen müssen denselben Verlauf und dieselbe Wickelrichtung verwenden.</w:t>
+        <w:t>Lege den isolierten Draht als durchgehende Serpentine um die 18 abgerundeten Führungskörper der stationären Kassette. Führe ihn abwechselnd an der Innen- und Außenseite der nächsten Führung vorbei. Markiere Anfang A, Ende B und den Weg einer vollständigen Wiederholung. Für diese Versuchsreihe zählt eine vollständige Runde um alle 18 Führungen als eine Windung. Alle Testspulen müssen denselben Verlauf und dieselbe Wickelrichtung verwenden.</w:t>
       </w:r>
     </w:p>
     <w:p>
@@ -3859,7 +3799,7 @@
     </w:p>
     <w:p>
       <w:r>
-        <w:t>Arbeite bei gesichertem Stillstand mit einer Montagehilfe, die die Anziehung der Magnetringe kontrolliert. Der Gehäusetopf öffnet nach oben. Prüfe vorab Muttertaschen, Schulter, Schlüssel und Kabelweg. Setze die sechs gefangenen M4-Muttern vor dem Verschließen vollständig ein.</w:t>
+        <w:t>Arbeite bei gesichertem Stillstand mit einer Montagehilfe, die die Anziehung der Magnetringe kontrolliert. Der Gehäusetopf öffnet nach oben. Prüfe vorab Muttertaschen, Schulter, Schlüssel und Kabelweg. Setze die vier gefangenen M4-Muttern vor dem Verschließen vollständig ein.</w:t>
       </w:r>
     </w:p>
     <w:p>
@@ -3870,7 +3810,7 @@
         <w:t xml:space="preserve">1. Unteren Magnetrotor einsetzen. </w:t>
       </w:r>
       <w:r>
-        <w:t>M8-Drehmomentmutter in die Rückentasche setzen. Unteren Rotor mit Welle und Distanzhülse in den Topf einsetzen, Magnetflächen nach oben. Der komplette Rotor bleibt innerhalb des Gehäuses; Mutter und Wellenende dürfen den geschlossenen Boden nicht berühren.</w:t>
+        <w:t>M8-Drehmomentmutter in die Rückentasche setzen. Unteren Rotor mit Welle und integrierter Distanzhülse in den Topf einsetzen, Magnetflächen nach oben. Der Magnetträger bleibt im Gehäuse; die Hülse läuft frei durch die stationäre Mitte. Mutter und Wellenende dürfen den geschlossenen Boden nicht berühren.</w:t>
       </w:r>
     </w:p>
     <w:p>
@@ -3892,7 +3832,7 @@
         <w:t xml:space="preserve">3. Stationären Deckel montieren. </w:t>
       </w:r>
       <w:r>
-        <w:t>Kabel aus dem seitlichen Ausgang führen und entlasten. Deckel plan aufsetzen und die sechs M4-Schrauben in gefangene Muttern einschrauben. Gleichmäßig und schrittweise über Kreuz anziehen; bei Spalt oder Verformung stoppen. Für PLA liegt kein geprüftes Anziehdrehmoment vor.</w:t>
+        <w:t>Kabel aus dem seitlichen Ausgang führen und entlasten. Deckel plan aufsetzen und die vier M4-Schrauben in gefangene Muttern einschrauben. Gleichmäßig und schrittweise über Kreuz anziehen; bei Spalt oder Verformung stoppen. Die getrennten äußeren Rahmenbohrungen bleiben dabei unberührt. Für PLA liegt kein geprüftes Anziehdrehmoment vor.</w:t>
       </w:r>
     </w:p>
     <w:p>
@@ -3946,7 +3886,7 @@
         <w:drawing>
           <wp:inline xmlns:a="http://schemas.openxmlformats.org/drawingml/2006/main" xmlns:pic="http://schemas.openxmlformats.org/drawingml/2006/picture">
             <wp:extent cx="6264000" cy="4384800"/>
-            <wp:docPr id="4" name="Picture 4" descr="E05. Der separate untere Magnetrotor läuft vollständig innerhalb des Gehäuses unter der Spulenkassette. Gehäuse vorn aufgeschnitten; Kassette und Deckel zur Einsicht ausgeblendet. Geschlossener Gehäuseboden · stationär Unterer Träger · rotierend Magnete nach oben zur Spule · rotierend M8-Drehmomentmutter in Rückentasche (verdeckt) Distanzhülse auf der M8-Welle · rotierend" title="E05"/>
+            <wp:docPr id="4" name="Picture 4" descr="E05. Der untere Magnetträger läuft im Gehäuse; seine integrierte Hülse reicht durch die stationäre Mitte. Gehäuse vorn aufgeschnitten; Kassette und Deckel zur Einsicht ausgeblendet. Geschlossener Gehäuseboden · stationär Unterer Träger · rotierend Magnete nach oben zur Spule · rotierend M8-Drehmomentmutter in Rückentasche (verdeckt) Integrierte Distanzhülse · rotierend" title="E05"/>
             <wp:cNvGraphicFramePr>
               <a:graphicFrameLocks noChangeAspect="1"/>
             </wp:cNvGraphicFramePr>
@@ -3983,12 +3923,12 @@
         <w:keepLines/>
       </w:pPr>
       <w:r>
-        <w:t>E05  Der separate untere Magnetrotor läuft vollständig innerhalb des Gehäuses unter der Spulenkassette.</w:t>
+        <w:t>E05  Der untere Magnetträger läuft im Gehäuse; seine integrierte Hülse reicht durch die stationäre Mitte.</w:t>
       </w:r>
     </w:p>
     <w:p>
       <w:r>
-        <w:t>Die Rückentasche überträgt Drehmoment über die M8-Mutter. Die Distanzhülse dreht mit der Welle; die Spule darf sie nicht berühren. Die im CAD reservierte Hülse misst 12 × 17,85 mm als Außendurchmesser und Länge. Reale Klemmung und Bodenabstand vor einem Zuschnitt trocken prüfen.</w:t>
+        <w:t>Die Rückentasche überträgt Drehmoment über die M8-Mutter. Die integrierte Distanzhülse ist Teil des unteren Magnetrotors und dreht mit ihm; die stationäre Spule darf sie nicht berühren. Die CAD-Hülse misst 12 × 17,85 mm als Außendurchmesser und Höhe, mit 8,8 mm M8-Durchgang. Reale Klemmung und Bodenabstand trocken prüfen.</w:t>
       </w:r>
     </w:p>
     <w:p>
@@ -4009,7 +3949,7 @@
         <w:drawing>
           <wp:inline xmlns:a="http://schemas.openxmlformats.org/drawingml/2006/main" xmlns:pic="http://schemas.openxmlformats.org/drawingml/2006/picture">
             <wp:extent cx="6264000" cy="4384800"/>
-            <wp:docPr id="5" name="Picture 5" descr="E06. Kassette, Deckel und Base sind angehoben; der untere Magnetrotor bleibt im aufgeschnittenen Gehäuse. Unterer Rotor unter der stationären Wicklung. Base-Blätter zur Lesbarkeit gekürzt. Base mit oberem Magnetträger · rotierend Deckel und 51105-Aufnahme · stationär Spulenkassette · stationär Aktiver Wicklungsraum · stationär Unterer Magnetrotor im Gehäuse · rotierend Gehäuse / Bodenlaschen · stationär 6 × M4-Deckelschraube (1 gezeigt) 6 × gefangene M4-Mutter (1 gezeigt) Beide Ringe haben 18 zur Wicklung weisende Pole, oben N S im Wechsel, unten S N. Gleiche Winkel in derselben +Z-Projektion tragen gegenüberliegende Pole; bei 0 Grad oben N und unten S, bei 20 Grad oben S und unten N." title="E06"/>
+            <wp:docPr id="5" name="Picture 5" descr="E06. Kassette, Deckel und Base sind angehoben; der untere Magnetrotor bleibt im aufgeschnittenen Gehäuse. Unterer Rotor unter der stationären Wicklung. Base-Blätter zur Lesbarkeit gekürzt. Base mit oberem Magnetträger · rotierend Deckel und 51105-Aufnahme · stationär Spulenkassette · stationär Aktiver Wicklungsraum · stationär Unterer Magnetrotor im Gehäuse · rotierend Gehäuse / Bodenlaschen · stationär 4 × M4-Deckelschraube (1 gezeigt) 4 × gefangene M4-Mutter (1 gezeigt) Beide Ringe haben 18 zur Wicklung weisende Pole, oben N S im Wechsel, unten S N. Gleiche Winkel in derselben +Z-Projektion tragen gegenüberliegende Pole; bei 0 Grad oben N und unten S, bei 20 Grad oben S und unten N." title="E06"/>
             <wp:cNvGraphicFramePr>
               <a:graphicFrameLocks noChangeAspect="1"/>
             </wp:cNvGraphicFramePr>
@@ -4208,7 +4148,7 @@
         <w:drawing>
           <wp:inline xmlns:a="http://schemas.openxmlformats.org/drawingml/2006/main" xmlns:pic="http://schemas.openxmlformats.org/drawingml/2006/picture">
             <wp:extent cx="6264000" cy="4384800"/>
-            <wp:docPr id="8" name="Picture 8" descr="E08. Die Kassette sitzt auf der Gehäuseschulter; der Deckel begrenzt den Hub nach oben. Der einzelne Schlüssel bei −X sperrt die Verdrehung. Passung am Segment-Coupon prüfen. Deckel hält die Kassette axial zurück Kassette mit einzelnem Verdrehsicherungssteg Gehäuseschulter und passende Schlüsselnut" title="E08"/>
+            <wp:docPr id="8" name="Picture 8" descr="E08. Die Kassette sitzt auf der Gehäuseschulter; der Deckel begrenzt den Hub nach oben. Der einzelne Schlüssel bei −X sperrt die Verdrehung. Passung am Segment-Coupon prüfen. Deckel hält die Kassette axial zurück Kassette mit 18 abgerundeten Führungskörpern Gehäuseschulter und passende Schlüsselnut" title="E08"/>
             <wp:cNvGraphicFramePr>
               <a:graphicFrameLocks noChangeAspect="1"/>
             </wp:cNvGraphicFramePr>
@@ -4271,7 +4211,7 @@
         <w:drawing>
           <wp:inline xmlns:a="http://schemas.openxmlformats.org/drawingml/2006/main" xmlns:pic="http://schemas.openxmlformats.org/drawingml/2006/picture">
             <wp:extent cx="6264000" cy="4384800"/>
-            <wp:docPr id="9" name="Picture 9" descr="E09. Sechs M4-Schrauben befestigen den stationären Deckel in gefangenen Muttern der Gehäuseaugen. Schrauben und Muttern sind Nennhüllen. Zugang von oben; reales Werkzeug prüfen. 6 × M4-Schraube · stationär Deckel mit sechs Durchgangsbohrungen Gehäuseaugen mit Sechskanttaschen 6 × gefangene M4-Mutter · stationär" title="E09"/>
+            <wp:docPr id="9" name="Picture 9" descr="E09. Vier M4-Schrauben befestigen den stationären Deckel; separate äußere Bohrungen befestigen das Gehäuse am Rahmen. Boss und Rahmenbohrung liegen auf derselben radialen Achse. Zugang von oben; reales Werkzeug prüfen. 4 × M4-Schraube · stationär Deckel mit vier Durchgangsbohrungen Verstärkte Boss-Laschen-Achsen 4 × gefangene M4-Mutter · stationär" title="E09"/>
             <wp:cNvGraphicFramePr>
               <a:graphicFrameLocks noChangeAspect="1"/>
             </wp:cNvGraphicFramePr>
@@ -4308,12 +4248,12 @@
         <w:keepLines/>
       </w:pPr>
       <w:r>
-        <w:t>E09  Sechs M4-Schrauben befestigen den stationären Deckel in gefangenen Muttern der Gehäuseaugen.</w:t>
+        <w:t>E09  Vier M4-Schrauben befestigen den stationären Deckel; separate äußere Bohrungen befestigen das Gehäuse am Rahmen.</w:t>
       </w:r>
     </w:p>
     <w:p>
       <w:r>
-        <w:t>Sechs M4-Schrauben und sechs gefangene Sechskantmuttern verbinden Deckel und Gehäuse. Der Schraubenzugang erfolgt von oben. Nach dem Anziehen muss der Deckel plan sitzen und die Welle weiterhin frei laufen. Markiere die Schraubenstellung für spätere Sichtkontrollen.</w:t>
+        <w:t>Vier M4-Schrauben und vier gefangene Sechskantmuttern verbinden Deckel und Gehäuse. Sie liegen auf denselben radialen Achsen wie die vier getrennten Rahmenbohrungen; die durchgehenden Bosse verstärken dabei die unteren Laschen. Der Schraubenzugang erfolgt von oben. Nach dem Anziehen muss der Deckel plan sitzen und die Welle weiterhin frei laufen.</w:t>
       </w:r>
     </w:p>
     <w:p>
@@ -5249,7 +5189,7 @@
         <w:t xml:space="preserve">3. Deckel abnehmen. </w:t>
       </w:r>
       <w:r>
-        <w:t>Lagerteile nach ihrer Orientierung getrennt ablegen. Sechs Deckelschrauben lösen, Deckel abheben und Kabelzugentlastung freigeben. Der untere Magnetrotor bleibt gesichert im Gehäuse.</w:t>
+        <w:t>Lagerteile nach ihrer Orientierung getrennt ablegen. Vier Deckelschrauben lösen, Deckel abheben und Kabelzugentlastung freigeben. Die getrennten Rahmenbefestigungen bleiben montiert; der untere Magnetrotor bleibt gesichert im Gehäuse.</w:t>
       </w:r>
     </w:p>
     <w:p>
@@ -5386,7 +5326,7 @@
               <w:rPr>
                 <w:sz w:val="20"/>
               </w:rPr>
-              <w:t>Magnetüberstand, Spulenhöhe, beide Luftspalte, Distanzhülse und axialen Versatz messen.</w:t>
+              <w:t>Magnetüberstand, Spulenhöhe, beide Luftspalte, integrierte Rotorhülse und axialen Versatz messen.</w:t>
             </w:r>
           </w:p>
         </w:tc>

</xml_diff>